<commit_message>
fix(security): prod secret guard, panel admin JWT, bearer zorunlulugu
Production startup CRON_SECRET ve PANEL_ADMIN_SECRET zorunlu; panel admin header bypass kaldirildi; AUTH_REQUIRE_BEARER prod'da etkisiz. SECURITY_BACKLOG ve audit checklist guncellendi.

Co-authored-by: Cursor <cursoragent@cursor.com>
</commit_message>
<xml_diff>
--- a/resto-pulse-mvp/docs/GastroSkor-Teknik-Audit-Checklist.docx
+++ b/resto-pulse-mvp/docs/GastroSkor-Teknik-Audit-Checklist.docx
@@ -19,11 +19,13 @@
         <w:rPr>
           <w:b/>
         </w:rPr>
-        <w:t>Tarih: 11 June 2026</w:t>
+        <w:t>Tarih: 21 June 2026</w:t>
         <w:br/>
       </w:r>
       <w:r>
-        <w:t>Kaynak: resto-pulse-mvp/ monorepo</w:t>
+        <w:t>Son guvenlik snapshot: 21 Haziran 2026</w:t>
+        <w:br/>
+        <w:t>Kaynak: resto-pulse-mvp/ monorepo | docs/SECURITY_BACKLOG.md (ertelenen isler)</w:t>
         <w:br/>
         <w:t>Canli: API https://api.gastroskor.com.tr | Web https://www.gastroskor.com.tr</w:t>
       </w:r>
@@ -34,7 +36,7 @@
         <w:rPr>
           <w:i/>
         </w:rPr>
-        <w:t>Durum kodlari:  VAR = mevcut ve calisiyor  |  KISMI = var ama eksik/yetersiz  |  YOK = hic yok  |  SISTEM = kullanilan teknoloji</w:t>
+        <w:t>Durum kodlari:  VAR = mevcut ve calisiyor  |  KISMI = var ama eksik/yetersiz  |  YOK = hic yok  |  TAMAM = 21.06.2026 guvenlik isi tamamlandi  |  SISTEM = kullanilan teknoloji</w:t>
       </w:r>
     </w:p>
     <w:p>
@@ -300,7 +302,7 @@
           <w:color w:val="333333"/>
           <w:sz w:val="20"/>
         </w:rPr>
-        <w:t>SecurityMiddleware korumali; cok sayida public GET endpoint var</w:t>
+        <w:t>SecurityMiddleware korumali; kasitli public GET endpoint'ler var (restoran listesi, canli yerler)</w:t>
       </w:r>
     </w:p>
     <w:p>
@@ -322,7 +324,7 @@
           <w:color w:val="333333"/>
           <w:sz w:val="20"/>
         </w:rPr>
-        <w:t>GET /health, /restaurants*, /live/places/*, /regional-flavors/*, /voice-products/catalog, POST /auth/google/*, POST /panel/applications, GET /media/*</w:t>
+        <w:t>GET /health, /restaurants*, /live/places/*, /regional-flavors/*, /voice-products/catalog, POST /auth/google/*, POST /auth/refresh, POST /panel/applications, GET /media/* — POST /voice/transcribe artik JWT zorunlu</w:t>
       </w:r>
     </w:p>
     <w:p>
@@ -344,7 +346,7 @@
           <w:color w:val="333333"/>
           <w:sz w:val="20"/>
         </w:rPr>
-        <w:t>In-memory: Auth 20/dk, Sync 30/dk, Places 60/dk, Review POST 20/saat, Social 120/dk, Panel 180/dk</w:t>
+        <w:t>Redis (primary) + in-memory fallback; path kurallari + kullanici global cap; /health rate_limit.redis_ok ile dogrulanir</w:t>
       </w:r>
     </w:p>
     <w:p>
@@ -545,7 +547,7 @@
           <w:b/>
           <w:sz w:val="22"/>
         </w:rPr>
-        <w:t>KISMI  Hassas veri depolama</w:t>
+        <w:t>VAR  Hassas veri depolama</w:t>
       </w:r>
     </w:p>
     <w:p>
@@ -558,7 +560,7 @@
           <w:color w:val="333333"/>
           <w:sz w:val="20"/>
         </w:rPr>
-        <w:t>JWT + session AsyncStorage'da; SecureStore/Keychain kullanilmiyor</w:t>
+        <w:t>JWT + refresh token expo-secure-store (Keychain/Keystore); session ozeti session-secure-storage</w:t>
       </w:r>
     </w:p>
     <w:p>
@@ -567,7 +569,7 @@
           <w:b/>
           <w:sz w:val="22"/>
         </w:rPr>
-        <w:t>KISMI  JWT saklama yeri</w:t>
+        <w:t>VAR  JWT saklama yeri</w:t>
       </w:r>
     </w:p>
     <w:p>
@@ -580,7 +582,7 @@
           <w:color w:val="333333"/>
           <w:sz w:val="20"/>
         </w:rPr>
-        <w:t>AsyncStorage (persist) + memory (auth-token.ts)</w:t>
+        <w:t>SecureStore (auth-token.ts) + bellek cache; AsyncStorage'da token yok</w:t>
       </w:r>
     </w:p>
     <w:p>
@@ -602,7 +604,7 @@
           <w:color w:val="333333"/>
           <w:sz w:val="20"/>
         </w:rPr>
-        <w:t>720 saat (30 gun) - jwt_access_token_expire_hours: 720</w:t>
+        <w:t>Access ~2 saat (jwt_access_token_expire_hours: 2); refresh ~30 gun</w:t>
       </w:r>
     </w:p>
     <w:p>
@@ -611,7 +613,7 @@
           <w:b/>
           <w:sz w:val="22"/>
         </w:rPr>
-        <w:t>YOK  Refresh token</w:t>
+        <w:t>VAR  Refresh token</w:t>
       </w:r>
     </w:p>
     <w:p>
@@ -624,7 +626,257 @@
           <w:color w:val="333333"/>
           <w:sz w:val="20"/>
         </w:rPr>
-        <w:t>Kullanici auth'ta refresh token yok; sure dolunca yeniden Google girisi</w:t>
+        <w:t>POST /auth/refresh; rotation + revoked_refresh_tokens tablosu (jti iptal listesi)</w:t>
+      </w:r>
+    </w:p>
+    <w:p>
+      <w:r>
+        <w:rPr>
+          <w:b/>
+          <w:sz w:val="22"/>
+        </w:rPr>
+        <w:t>VAR  Mobil token garantisi</w:t>
+      </w:r>
+    </w:p>
+    <w:p>
+      <w:pPr>
+        <w:spacing w:after="120"/>
+        <w:ind w:left="360"/>
+      </w:pPr>
+      <w:r>
+        <w:rPr>
+          <w:color w:val="333333"/>
+          <w:sz w:val="20"/>
+        </w:rPr>
+        <w:t>lib/api.ts request() oncesi ensureAccessToken(); voice-whisper-transcribe ayri cagiriyor</w:t>
+      </w:r>
+    </w:p>
+    <w:p>
+      <w:pPr>
+        <w:pStyle w:val="Heading2"/>
+      </w:pPr>
+      <w:r>
+        <w:t>Tamamlanan Guvenlik Islemleri (21 Haziran 2026)</w:t>
+      </w:r>
+    </w:p>
+    <w:p>
+      <w:r>
+        <w:rPr>
+          <w:b/>
+          <w:sz w:val="22"/>
+        </w:rPr>
+        <w:t>TAMAM  Review / feedback IDOR</w:t>
+      </w:r>
+    </w:p>
+    <w:p>
+      <w:pPr>
+        <w:spacing w:after="120"/>
+        <w:ind w:left="360"/>
+      </w:pPr>
+      <w:r>
+        <w:rPr>
+          <w:color w:val="333333"/>
+          <w:sz w:val="20"/>
+        </w:rPr>
+        <w:t>resolve_authenticated_email ile JWT != claimed_email engeli; test_author_identity_idor.py</w:t>
+      </w:r>
+    </w:p>
+    <w:p>
+      <w:r>
+        <w:rPr>
+          <w:b/>
+          <w:sz w:val="22"/>
+        </w:rPr>
+        <w:t>TAMAM  Public voice/transcribe auth acigi</w:t>
+      </w:r>
+    </w:p>
+    <w:p>
+      <w:pPr>
+        <w:spacing w:after="120"/>
+        <w:ind w:left="360"/>
+      </w:pPr>
+      <w:r>
+        <w:rPr>
+          <w:color w:val="333333"/>
+          <w:sz w:val="20"/>
+        </w:rPr>
+        <w:t>POST /api/v1/voice/transcribe JWT zorunlu (middleware + require_request_auth); test_voice_transcription.py</w:t>
+      </w:r>
+    </w:p>
+    <w:p>
+      <w:r>
+        <w:rPr>
+          <w:b/>
+          <w:sz w:val="22"/>
+        </w:rPr>
+        <w:t>TAMAM  Mobil token garantisi</w:t>
+      </w:r>
+    </w:p>
+    <w:p>
+      <w:pPr>
+        <w:spacing w:after="120"/>
+        <w:ind w:left="360"/>
+      </w:pPr>
+      <w:r>
+        <w:rPr>
+          <w:color w:val="333333"/>
+          <w:sz w:val="20"/>
+        </w:rPr>
+        <w:t>ensureAccessToken() tum API isteklerinde; Whisper upload oncesi token kontrolu</w:t>
+      </w:r>
+    </w:p>
+    <w:p>
+      <w:r>
+        <w:rPr>
+          <w:b/>
+          <w:sz w:val="22"/>
+        </w:rPr>
+        <w:t>TAMAM  Refresh token rotation + revocation</w:t>
+      </w:r>
+    </w:p>
+    <w:p>
+      <w:pPr>
+        <w:spacing w:after="120"/>
+        <w:ind w:left="360"/>
+      </w:pPr>
+      <w:r>
+        <w:rPr>
+          <w:color w:val="333333"/>
+          <w:sz w:val="20"/>
+        </w:rPr>
+        <w:t>revoked_refresh_tokens migration; POST /auth/refresh yeni cift dondurur; eski jti iptal</w:t>
+      </w:r>
+    </w:p>
+    <w:p>
+      <w:r>
+        <w:rPr>
+          <w:b/>
+          <w:sz w:val="22"/>
+        </w:rPr>
+        <w:t>TAMAM  SecureStore migrasyonu</w:t>
+      </w:r>
+    </w:p>
+    <w:p>
+      <w:pPr>
+        <w:spacing w:after="120"/>
+        <w:ind w:left="360"/>
+      </w:pPr>
+      <w:r>
+        <w:rPr>
+          <w:color w:val="333333"/>
+          <w:sz w:val="20"/>
+        </w:rPr>
+        <w:t>access + refresh token AsyncStorage'dan SecureStore'a tasindi</w:t>
+      </w:r>
+    </w:p>
+    <w:p>
+      <w:r>
+        <w:rPr>
+          <w:b/>
+          <w:sz w:val="22"/>
+        </w:rPr>
+        <w:t>TAMAM  Redis rate limiting</w:t>
+      </w:r>
+    </w:p>
+    <w:p>
+      <w:pPr>
+        <w:spacing w:after="120"/>
+        <w:ind w:left="360"/>
+      </w:pPr>
+      <w:r>
+        <w:rPr>
+          <w:color w:val="333333"/>
+          <w:sz w:val="20"/>
+        </w:rPr>
+        <w:t>REDIS_URL ile dagitik limiter; Railway'de gastroskor:rl* anahtarlari</w:t>
+      </w:r>
+    </w:p>
+    <w:p>
+      <w:r>
+        <w:rPr>
+          <w:b/>
+          <w:sz w:val="22"/>
+        </w:rPr>
+        <w:t>TAMAM  CI/CD pipeline</w:t>
+      </w:r>
+    </w:p>
+    <w:p>
+      <w:pPr>
+        <w:spacing w:after="120"/>
+        <w:ind w:left="360"/>
+      </w:pPr>
+      <w:r>
+        <w:rPr>
+          <w:color w:val="333333"/>
+          <w:sz w:val="20"/>
+        </w:rPr>
+        <w:t>GitHub Actions: backend-ci.yml (pytest + pip-audit), mobile-ci.yml (npm audit high + tsc + test)</w:t>
+      </w:r>
+    </w:p>
+    <w:p>
+      <w:r>
+        <w:rPr>
+          <w:b/>
+          <w:sz w:val="22"/>
+        </w:rPr>
+        <w:t>TAMAM  npm audit high</w:t>
+      </w:r>
+    </w:p>
+    <w:p>
+      <w:pPr>
+        <w:spacing w:after="120"/>
+        <w:ind w:left="360"/>
+      </w:pPr>
+      <w:r>
+        <w:rPr>
+          <w:color w:val="333333"/>
+          <w:sz w:val="20"/>
+        </w:rPr>
+        <w:t>undici + tar duzeltildi; 0 high, 23 moderate (Expo ekosistemi — SECURITY_BACKLOG.md)</w:t>
+      </w:r>
+    </w:p>
+    <w:p>
+      <w:r>
+        <w:rPr>
+          <w:b/>
+          <w:sz w:val="22"/>
+        </w:rPr>
+        <w:t>TAMAM  Backend test suite</w:t>
+      </w:r>
+    </w:p>
+    <w:p>
+      <w:pPr>
+        <w:spacing w:after="120"/>
+        <w:ind w:left="360"/>
+      </w:pPr>
+      <w:r>
+        <w:rPr>
+          <w:color w:val="333333"/>
+          <w:sz w:val="20"/>
+        </w:rPr>
+        <w:t>260/260 pytest (SQLite JSONB/UUID compat conftest dahil)</w:t>
+      </w:r>
+    </w:p>
+    <w:p>
+      <w:r>
+        <w:rPr>
+          <w:b/>
+          <w:sz w:val="22"/>
+        </w:rPr>
+        <w:t>TAMAM  Mobile TypeScript CI</w:t>
+      </w:r>
+    </w:p>
+    <w:p>
+      <w:pPr>
+        <w:spacing w:after="120"/>
+        <w:ind w:left="360"/>
+      </w:pPr>
+      <w:r>
+        <w:rPr>
+          <w:color w:val="333333"/>
+          <w:sz w:val="20"/>
+        </w:rPr>
+        <w:t>tsc --noEmit 0 hata (21.06.2026)</w:t>
       </w:r>
     </w:p>
     <w:p>
@@ -891,7 +1143,7 @@
           <w:b/>
           <w:sz w:val="22"/>
         </w:rPr>
-        <w:t>YOK  Crash reporting</w:t>
+        <w:t>VAR  Crash reporting</w:t>
       </w:r>
     </w:p>
     <w:p>
@@ -904,7 +1156,7 @@
           <w:color w:val="333333"/>
           <w:sz w:val="20"/>
         </w:rPr>
-        <w:t>Sentry/Bugsnag/Crashlytics entegrasyonu yok</w:t>
+        <w:t>@sentry/react-native prod'da aktif; sentry-scrub PII redaction + beforeSend</w:t>
       </w:r>
     </w:p>
     <w:p>
@@ -1223,7 +1475,7 @@
           <w:b/>
           <w:sz w:val="22"/>
         </w:rPr>
-        <w:t>KISMI  Otomatik test</w:t>
+        <w:t>VAR  Otomatik test</w:t>
       </w:r>
     </w:p>
     <w:p>
@@ -1236,7 +1488,7 @@
           <w:color w:val="333333"/>
           <w:sz w:val="20"/>
         </w:rPr>
-        <w:t>Backend: 26 test dosyasi, ~116 test fonksiyonu (pytest). Mobil/frontend: yok</w:t>
+        <w:t>Backend: 26+ test dosyasi, 260 pytest (CI'da). Mobil: sentry-scrub.test.ts (node:test)</w:t>
       </w:r>
     </w:p>
     <w:p>
@@ -1319,7 +1571,7 @@
           <w:b/>
           <w:sz w:val="22"/>
         </w:rPr>
-        <w:t>YOK  CI/CD pipeline</w:t>
+        <w:t>VAR  CI/CD pipeline</w:t>
       </w:r>
     </w:p>
     <w:p>
@@ -1332,7 +1584,7 @@
           <w:color w:val="333333"/>
           <w:sz w:val="20"/>
         </w:rPr>
-        <w:t>.github/ workflow yok; deploy manuel (EAS + Railway + Vercel)</w:t>
+        <w:t>.github/workflows: backend-ci.yml, mobile-ci.yml, sofra-bulmaca-daily.yml</w:t>
       </w:r>
     </w:p>
     <w:p>
@@ -1656,7 +1908,7 @@
           <w:color w:val="333333"/>
           <w:sz w:val="20"/>
         </w:rPr>
-        <w:t>Mobil: 15 moderate vulnerability; npm audit fix uygulanmamis</w:t>
+        <w:t>Mobil: 23 moderate, 0 high (21.06.2026); moderate Expo transitive — SECURITY_BACKLOG.md</w:t>
       </w:r>
     </w:p>
     <w:p>
@@ -1813,7 +2065,7 @@
           </w:tcPr>
           <w:p>
             <w:r>
-              <w:t>15</w:t>
+              <w:t>20</w:t>
             </w:r>
           </w:p>
         </w:tc>
@@ -1823,7 +2075,7 @@
           </w:tcPr>
           <w:p>
             <w:r>
-              <w:t>6</w:t>
+              <w:t>12</w:t>
             </w:r>
           </w:p>
         </w:tc>
@@ -1833,7 +2085,7 @@
           </w:tcPr>
           <w:p>
             <w:r>
-              <w:t>7</w:t>
+              <w:t>5</w:t>
             </w:r>
           </w:p>
         </w:tc>
@@ -1843,7 +2095,7 @@
           </w:tcPr>
           <w:p>
             <w:r>
-              <w:t>2</w:t>
+              <w:t>0</w:t>
             </w:r>
           </w:p>
         </w:tc>
@@ -1927,7 +2179,7 @@
           </w:tcPr>
           <w:p>
             <w:r>
-              <w:t>2</w:t>
+              <w:t>3</w:t>
             </w:r>
           </w:p>
         </w:tc>
@@ -1947,7 +2199,7 @@
           </w:tcPr>
           <w:p>
             <w:r>
-              <w:t>2</w:t>
+              <w:t>1</w:t>
             </w:r>
           </w:p>
         </w:tc>
@@ -2125,7 +2377,7 @@
           </w:tcPr>
           <w:p>
             <w:r>
-              <w:t>49</w:t>
+              <w:t>54</w:t>
             </w:r>
           </w:p>
         </w:tc>
@@ -2135,7 +2387,7 @@
           </w:tcPr>
           <w:p>
             <w:r>
-              <w:t>17</w:t>
+              <w:t>24</w:t>
             </w:r>
           </w:p>
         </w:tc>
@@ -2145,7 +2397,7 @@
           </w:tcPr>
           <w:p>
             <w:r>
-              <w:t>23</w:t>
+              <w:t>21</w:t>
             </w:r>
           </w:p>
         </w:tc>
@@ -2155,7 +2407,7 @@
           </w:tcPr>
           <w:p>
             <w:r>
-              <w:t>9</w:t>
+              <w:t>6</w:t>
             </w:r>
           </w:p>
         </w:tc>
@@ -2175,7 +2427,7 @@
           <w:b/>
           <w:sz w:val="22"/>
         </w:rPr>
-        <w:t>YUKSEK  JWT AsyncStorage'da</w:t>
+        <w:t>YUKSEK  DB yedek / PITR yok</w:t>
       </w:r>
     </w:p>
     <w:p>
@@ -2188,7 +2440,7 @@
           <w:color w:val="333333"/>
           <w:sz w:val="20"/>
         </w:rPr>
-        <w:t>expo-secure-store'a tasi</w:t>
+        <w:t>Ilk gercek restoran + online siparis -&gt; Railway Pro + PITR (SECURITY_BACKLOG.md)</w:t>
       </w:r>
     </w:p>
     <w:p>
@@ -2197,7 +2449,7 @@
           <w:b/>
           <w:sz w:val="22"/>
         </w:rPr>
-        <w:t>YUKSEK  Crash reporting yok</w:t>
+        <w:t>ORTA  npm audit 23 moderate</w:t>
       </w:r>
     </w:p>
     <w:p>
@@ -2210,7 +2462,7 @@
           <w:color w:val="333333"/>
           <w:sz w:val="20"/>
         </w:rPr>
-        <w:t>Sentry veya Expo Crashlytics ekle</w:t>
+        <w:t>Expo SDK major upgrade ile birlikte npm audit fix --force (SECURITY_BACKLOG.md)</w:t>
       </w:r>
     </w:p>
     <w:p>
@@ -2219,73 +2471,7 @@
           <w:b/>
           <w:sz w:val="22"/>
         </w:rPr>
-        <w:t>ORTA  Refresh token yok</w:t>
-      </w:r>
-    </w:p>
-    <w:p>
-      <w:pPr>
-        <w:spacing w:after="120"/>
-        <w:ind w:left="360"/>
-      </w:pPr>
-      <w:r>
-        <w:rPr>
-          <w:color w:val="333333"/>
-          <w:sz w:val="20"/>
-        </w:rPr>
-        <w:t>Token yenileme veya silent re-auth</w:t>
-      </w:r>
-    </w:p>
-    <w:p>
-      <w:r>
-        <w:rPr>
-          <w:b/>
-          <w:sz w:val="22"/>
-        </w:rPr>
-        <w:t>ORTA  CI/CD yok</w:t>
-      </w:r>
-    </w:p>
-    <w:p>
-      <w:pPr>
-        <w:spacing w:after="120"/>
-        <w:ind w:left="360"/>
-      </w:pPr>
-      <w:r>
-        <w:rPr>
-          <w:color w:val="333333"/>
-          <w:sz w:val="20"/>
-        </w:rPr>
-        <w:t>GitHub Actions: backend test + lint</w:t>
-      </w:r>
-    </w:p>
-    <w:p>
-      <w:r>
-        <w:rPr>
-          <w:b/>
-          <w:sz w:val="22"/>
-        </w:rPr>
-        <w:t>ORTA  npm audit 15 moderate</w:t>
-      </w:r>
-    </w:p>
-    <w:p>
-      <w:pPr>
-        <w:spacing w:after="120"/>
-        <w:ind w:left="360"/>
-      </w:pPr>
-      <w:r>
-        <w:rPr>
-          <w:color w:val="333333"/>
-          <w:sz w:val="20"/>
-        </w:rPr>
-        <w:t>npm audit fix + dependency guncelleme</w:t>
-      </w:r>
-    </w:p>
-    <w:p>
-      <w:r>
-        <w:rPr>
-          <w:b/>
-          <w:sz w:val="22"/>
-        </w:rPr>
-        <w:t>DUSUK  Global error handler</w:t>
+        <w:t>ORTA  Global error handler</w:t>
       </w:r>
     </w:p>
     <w:p>
@@ -2307,7 +2493,7 @@
           <w:b/>
           <w:sz w:val="22"/>
         </w:rPr>
-        <w:t>DUSUK  API cache / pagination</w:t>
+        <w:t>ORTA  API cache / pagination</w:t>
       </w:r>
     </w:p>
     <w:p>
@@ -2321,6 +2507,50 @@
           <w:sz w:val="20"/>
         </w:rPr>
         <w:t>Liste endpoint'lerinde cursor pagination</w:t>
+      </w:r>
+    </w:p>
+    <w:p>
+      <w:r>
+        <w:rPr>
+          <w:b/>
+          <w:sz w:val="22"/>
+        </w:rPr>
+        <w:t>DUSUK  XSS / CSP audit</w:t>
+      </w:r>
+    </w:p>
+    <w:p>
+      <w:pPr>
+        <w:spacing w:after="120"/>
+        <w:ind w:left="360"/>
+      </w:pPr>
+      <w:r>
+        <w:rPr>
+          <w:color w:val="333333"/>
+          <w:sz w:val="20"/>
+        </w:rPr>
+        <w:t>Next.js security headers ve CSP politikasi gozden gecir</w:t>
+      </w:r>
+    </w:p>
+    <w:p>
+      <w:r>
+        <w:rPr>
+          <w:b/>
+          <w:sz w:val="22"/>
+        </w:rPr>
+        <w:t>DUSUK  Uptime monitoring</w:t>
+      </w:r>
+    </w:p>
+    <w:p>
+      <w:pPr>
+        <w:spacing w:after="120"/>
+        <w:ind w:left="360"/>
+      </w:pPr>
+      <w:r>
+        <w:rPr>
+          <w:color w:val="333333"/>
+          <w:sz w:val="20"/>
+        </w:rPr>
+        <w:t>UptimeRobot veya benzeri /health disi alarm</w:t>
       </w:r>
     </w:p>
     <w:sectPr>

</xml_diff>